<commit_message>
cleaned up pump speed guards; final mcc merge dcoument
</commit_message>
<xml_diff>
--- a/CROSSBOW_COMMON_CLASS_LIBRARY/Authoritative Documents/Other Refernces/MCC_PMS_Architecture.docx
+++ b/CROSSBOW_COMMON_CLASS_LIBRARY/Authoritative Documents/Other Refernces/MCC_PMS_Architecture.docx
@@ -581,7 +581,7 @@
           <w:sz w:val="18"/>
           <w:szCs w:val="18"/>
         </w:rPr>
-        <w:t xml:space="preserve">RELAY_GPS (pin 67) → GPS appliance 24V</w:t>
+        <w:t xml:space="preserve">RELAY_GPS (pin 54) → GPS appliance 24V</w:t>
       </w:r>
     </w:p>
     <w:p>
@@ -619,7 +619,7 @@
           <w:sz w:val="18"/>
           <w:szCs w:val="18"/>
         </w:rPr>
-        <w:t xml:space="preserve">RELAY_LASER (pin 54) → 3kW laser digital bus 24V</w:t>
+        <w:t xml:space="preserve">RELAY_LASER (pin 67) → 3kW laser digital bus 24V</w:t>
       </w:r>
     </w:p>
     <w:p>
@@ -775,7 +775,7 @@
           <w:sz w:val="18"/>
           <w:szCs w:val="18"/>
         </w:rPr>
-        <w:t xml:space="preserve">RELAY_GPS (pin 67) → GPS appliance 24V</w:t>
+        <w:t xml:space="preserve">RELAY_GPS (pin 54) → GPS appliance 24V</w:t>
       </w:r>
     </w:p>
     <w:p>
@@ -813,7 +813,7 @@
           <w:sz w:val="18"/>
           <w:szCs w:val="18"/>
         </w:rPr>
-        <w:t xml:space="preserve">RELAY_LASER not driven (pin 54 unused on 6kW path)</w:t>
+        <w:t xml:space="preserve">RELAY_LASER not driven (pin 67 unused on 6kW path)</w:t>
       </w:r>
     </w:p>
     <w:p>
@@ -1890,7 +1890,7 @@
                 <w:sz w:val="17"/>
                 <w:szCs w:val="17"/>
               </w:rPr>
-              <w:t xml:space="preserve">pin 67</w:t>
+              <w:t xml:space="preserve">pin 54</w:t>
             </w:r>
             <w:r>
               <w:rPr>
@@ -1937,7 +1937,7 @@
                 <w:sz w:val="17"/>
                 <w:szCs w:val="17"/>
               </w:rPr>
-              <w:t xml:space="preserve">pin 67</w:t>
+              <w:t xml:space="preserve">pin 54</w:t>
             </w:r>
             <w:r>
               <w:rPr>
@@ -2229,7 +2229,7 @@
                 <w:sz w:val="17"/>
                 <w:szCs w:val="17"/>
               </w:rPr>
-              <w:t xml:space="preserve">pin 54</w:t>
+              <w:t xml:space="preserve">pin 67</w:t>
             </w:r>
             <w:r>
               <w:rPr>

</xml_diff>